<commit_message>
Add the block diagrams and the full comparison chart to the work report
The work report had the nine results figures but none of the four added
for the article, so it described the pipeline and the architecture in prose
while the diagrams sat unused in Results/Genuine.

Section 4 now carries the executed pipeline, SMA-CLMPNet with the tensor
shape after every stage, and the evaluation protocol. The architecture
caption calls out the pooling explicitly -- window 1 stride 1 does no
downsampling and window 1 stride 2 decimates rather than pools -- because
that is the kind of detail a reader will otherwise assume away.

Section 6.5 gains fig13, the full sixteen-method comparison, next to the
five-method fig08 it complements. Both captions now name the estimator per
bar rather than implying the numbers are interchangeable.

13 images embedded, up from 9.

Co-Authored-By: Claude Opus 5 <noreply@anthropic.com>
</commit_message>
<xml_diff>
--- a/Paper1_Complete_Work_Report.docx
+++ b/Paper1_Complete_Work_Report.docx
@@ -79,7 +79,7 @@
         <w:pStyle w:val="Caption"/>
       </w:pPr>
       <w:r>
-        <w:t xml:space="preserve">Generated 2026-08-06 12:43:20. Windows 11, conda env VideoForgeryCPU (Python 3.8.20, TensorFlow 2.10, CPU only). Every figure in this record was scored with Optimized/metrics_fixed.py and traces to a named file in the repository.</w:t>
+        <w:t xml:space="preserve">Generated 2026-08-07 10:18:40. Windows 11, conda env VideoForgeryCPU (Python 3.8.20, TensorFlow 2.10, CPU only). Every figure in this record was scored with Optimized/metrics_fixed.py and traces to a named file in the repository.</w:t>
       </w:r>
     </w:p>
     <w:p>
@@ -2772,6 +2772,150 @@
     </w:p>
     <w:p>
       <w:pPr>
+        <w:pStyle w:val="Normal"/>
+        <w:jc w:val="center"/>
+        <w:spacing w:before="160" w:after="60"/>
+      </w:pPr>
+      <w:r>
+        <w:drawing>
+          <wp:inline distT="0" distB="0" distL="0" distR="0">
+            <wp:extent cx="5669280" cy="2631585"/>
+            <wp:docPr id="1" name="Picture 1" descr="fig10_pipeline_block_diagram"/>
+            <a:graphic xmlns:a="http://schemas.openxmlformats.org/drawingml/2006/main">
+              <a:graphicData uri="http://schemas.openxmlformats.org/drawingml/2006/picture">
+                <pic:pic xmlns:pic="http://schemas.openxmlformats.org/drawingml/2006/picture">
+                  <pic:nvPicPr>
+                    <pic:cNvPr id="1" name="fig10_pipeline_block_diagram.png"/>
+                    <pic:cNvPicPr/>
+                  </pic:nvPicPr>
+                  <pic:blipFill>
+                    <a:blip r:embed="rIdImg1"/>
+                    <a:stretch>
+                      <a:fillRect/>
+                    </a:stretch>
+                  </pic:blipFill>
+                  <pic:spPr>
+                    <a:xfrm>
+                      <a:off x="0" y="0"/>
+                      <a:ext cx="5669280" cy="2631585"/>
+                    </a:xfrm>
+                    <a:prstGeom prst="rect">
+                      <a:avLst/>
+                    </a:prstGeom>
+                  </pic:spPr>
+                </pic:pic>
+              </a:graphicData>
+            </a:graphic>
+          </wp:inline>
+        </w:drawing>
+      </w:r>
+    </w:p>
+    <w:p>
+      <w:pPr>
+        <w:pStyle w:val="Caption"/>
+      </w:pPr>
+      <w:r>
+        <w:t xml:space="preserve">Figure A. The pipeline as executed, drawn from the source rather than from the paper's description. Feature tensors are computed once and shared by every model, so all comparisons below differ only in the model.</w:t>
+      </w:r>
+    </w:p>
+    <w:p>
+      <w:pPr>
+        <w:pStyle w:val="Normal"/>
+        <w:jc w:val="center"/>
+        <w:spacing w:before="160" w:after="60"/>
+      </w:pPr>
+      <w:r>
+        <w:drawing>
+          <wp:inline distT="0" distB="0" distL="0" distR="0">
+            <wp:extent cx="5669280" cy="3229377"/>
+            <wp:docPr id="2" name="Picture 2" descr="fig11_smaclmpnet_architecture"/>
+            <a:graphic xmlns:a="http://schemas.openxmlformats.org/drawingml/2006/main">
+              <a:graphicData uri="http://schemas.openxmlformats.org/drawingml/2006/picture">
+                <pic:pic xmlns:pic="http://schemas.openxmlformats.org/drawingml/2006/picture">
+                  <pic:nvPicPr>
+                    <pic:cNvPr id="2" name="fig11_smaclmpnet_architecture.png"/>
+                    <pic:cNvPicPr/>
+                  </pic:nvPicPr>
+                  <pic:blipFill>
+                    <a:blip r:embed="rIdImg2"/>
+                    <a:stretch>
+                      <a:fillRect/>
+                    </a:stretch>
+                  </pic:blipFill>
+                  <pic:spPr>
+                    <a:xfrm>
+                      <a:off x="0" y="0"/>
+                      <a:ext cx="5669280" cy="3229377"/>
+                    </a:xfrm>
+                    <a:prstGeom prst="rect">
+                      <a:avLst/>
+                    </a:prstGeom>
+                  </pic:spPr>
+                </pic:pic>
+              </a:graphicData>
+            </a:graphic>
+          </wp:inline>
+        </w:drawing>
+      </w:r>
+    </w:p>
+    <w:p>
+      <w:pPr>
+        <w:pStyle w:val="Caption"/>
+      </w:pPr>
+      <w:r>
+        <w:t xml:space="preserve">Figure B. SMA-CLMPNet as implemented (SubFunctions/Model.py:447-513). Shapes are recomputed from the (10, 128, 128, 12) input, so the figure cannot drift from the code. Note the pooling: window 1 with stride 1 in the first stage does no downsampling, and window 1 with stride 2 in the next two decimates rather than pools.</w:t>
+      </w:r>
+    </w:p>
+    <w:p>
+      <w:pPr>
+        <w:pStyle w:val="Normal"/>
+        <w:jc w:val="center"/>
+        <w:spacing w:before="160" w:after="60"/>
+      </w:pPr>
+      <w:r>
+        <w:drawing>
+          <wp:inline distT="0" distB="0" distL="0" distR="0">
+            <wp:extent cx="5669280" cy="2194766"/>
+            <wp:docPr id="3" name="Picture 3" descr="fig12_evaluation_protocol"/>
+            <a:graphic xmlns:a="http://schemas.openxmlformats.org/drawingml/2006/main">
+              <a:graphicData uri="http://schemas.openxmlformats.org/drawingml/2006/picture">
+                <pic:pic xmlns:pic="http://schemas.openxmlformats.org/drawingml/2006/picture">
+                  <pic:nvPicPr>
+                    <pic:cNvPr id="3" name="fig12_evaluation_protocol.png"/>
+                    <pic:cNvPicPr/>
+                  </pic:nvPicPr>
+                  <pic:blipFill>
+                    <a:blip r:embed="rIdImg3"/>
+                    <a:stretch>
+                      <a:fillRect/>
+                    </a:stretch>
+                  </pic:blipFill>
+                  <pic:spPr>
+                    <a:xfrm>
+                      <a:off x="0" y="0"/>
+                      <a:ext cx="5669280" cy="2194766"/>
+                    </a:xfrm>
+                    <a:prstGeom prst="rect">
+                      <a:avLst/>
+                    </a:prstGeom>
+                  </pic:spPr>
+                </pic:pic>
+              </a:graphicData>
+            </a:graphic>
+          </wp:inline>
+        </w:drawing>
+      </w:r>
+    </w:p>
+    <w:p>
+      <w:pPr>
+        <w:pStyle w:val="Caption"/>
+      </w:pPr>
+      <w:r>
+        <w:t xml:space="preserve">Figure C. The protocol used for every number in section 5 onward. Everything selected is selected inside the training folds; the outer test fold is read once, at scoring time.</w:t>
+      </w:r>
+    </w:p>
+    <w:p>
+      <w:pPr>
         <w:pStyle w:val="Heading1"/>
       </w:pPr>
       <w:r>
@@ -5705,16 +5849,16 @@
         <w:drawing>
           <wp:inline distT="0" distB="0" distL="0" distR="0">
             <wp:extent cx="5669280" cy="3636383"/>
-            <wp:docPr id="1" name="Picture 1" descr="fig01_balanced_accuracy_by_model"/>
+            <wp:docPr id="4" name="Picture 4" descr="fig01_balanced_accuracy_by_model"/>
             <a:graphic xmlns:a="http://schemas.openxmlformats.org/drawingml/2006/main">
               <a:graphicData uri="http://schemas.openxmlformats.org/drawingml/2006/picture">
                 <pic:pic xmlns:pic="http://schemas.openxmlformats.org/drawingml/2006/picture">
                   <pic:nvPicPr>
-                    <pic:cNvPr id="1" name="fig01_balanced_accuracy_by_model.png"/>
+                    <pic:cNvPr id="4" name="fig01_balanced_accuracy_by_model.png"/>
                     <pic:cNvPicPr/>
                   </pic:nvPicPr>
                   <pic:blipFill>
-                    <a:blip r:embed="rIdImg1"/>
+                    <a:blip r:embed="rIdImg4"/>
                     <a:stretch>
                       <a:fillRect/>
                     </a:stretch>
@@ -5753,16 +5897,16 @@
         <w:drawing>
           <wp:inline distT="0" distB="0" distL="0" distR="0">
             <wp:extent cx="5669280" cy="3639873"/>
-            <wp:docPr id="2" name="Picture 2" descr="fig02_accuracy_by_model"/>
+            <wp:docPr id="5" name="Picture 5" descr="fig02_accuracy_by_model"/>
             <a:graphic xmlns:a="http://schemas.openxmlformats.org/drawingml/2006/main">
               <a:graphicData uri="http://schemas.openxmlformats.org/drawingml/2006/picture">
                 <pic:pic xmlns:pic="http://schemas.openxmlformats.org/drawingml/2006/picture">
                   <pic:nvPicPr>
-                    <pic:cNvPr id="2" name="fig02_accuracy_by_model.png"/>
+                    <pic:cNvPr id="5" name="fig02_accuracy_by_model.png"/>
                     <pic:cNvPicPr/>
                   </pic:nvPicPr>
                   <pic:blipFill>
-                    <a:blip r:embed="rIdImg2"/>
+                    <a:blip r:embed="rIdImg5"/>
                     <a:stretch>
                       <a:fillRect/>
                     </a:stretch>
@@ -8056,16 +8200,16 @@
         <w:drawing>
           <wp:inline distT="0" distB="0" distL="0" distR="0">
             <wp:extent cx="5669280" cy="3520176"/>
-            <wp:docPr id="3" name="Picture 3" descr="fig03_accuracy_vs_training_percentage"/>
+            <wp:docPr id="6" name="Picture 6" descr="fig03_accuracy_vs_training_percentage"/>
             <a:graphic xmlns:a="http://schemas.openxmlformats.org/drawingml/2006/main">
               <a:graphicData uri="http://schemas.openxmlformats.org/drawingml/2006/picture">
                 <pic:pic xmlns:pic="http://schemas.openxmlformats.org/drawingml/2006/picture">
                   <pic:nvPicPr>
-                    <pic:cNvPr id="3" name="fig03_accuracy_vs_training_percentage.png"/>
+                    <pic:cNvPr id="6" name="fig03_accuracy_vs_training_percentage.png"/>
                     <pic:cNvPicPr/>
                   </pic:nvPicPr>
                   <pic:blipFill>
-                    <a:blip r:embed="rIdImg3"/>
+                    <a:blip r:embed="rIdImg6"/>
                     <a:stretch>
                       <a:fillRect/>
                     </a:stretch>
@@ -9839,16 +9983,16 @@
         <w:drawing>
           <wp:inline distT="0" distB="0" distL="0" distR="0">
             <wp:extent cx="5669280" cy="3453469"/>
-            <wp:docPr id="4" name="Picture 4" descr="fig04_kfold_balanced_accuracy"/>
+            <wp:docPr id="7" name="Picture 7" descr="fig04_kfold_balanced_accuracy"/>
             <a:graphic xmlns:a="http://schemas.openxmlformats.org/drawingml/2006/main">
               <a:graphicData uri="http://schemas.openxmlformats.org/drawingml/2006/picture">
                 <pic:pic xmlns:pic="http://schemas.openxmlformats.org/drawingml/2006/picture">
                   <pic:nvPicPr>
-                    <pic:cNvPr id="4" name="fig04_kfold_balanced_accuracy.png"/>
+                    <pic:cNvPr id="7" name="fig04_kfold_balanced_accuracy.png"/>
                     <pic:cNvPicPr/>
                   </pic:nvPicPr>
                   <pic:blipFill>
-                    <a:blip r:embed="rIdImg4"/>
+                    <a:blip r:embed="rIdImg7"/>
                     <a:stretch>
                       <a:fillRect/>
                     </a:stretch>
@@ -10363,16 +10507,16 @@
         <w:drawing>
           <wp:inline distT="0" distB="0" distL="0" distR="0">
             <wp:extent cx="5669280" cy="5618960"/>
-            <wp:docPr id="5" name="Picture 5" descr="fig05_roc_curve"/>
+            <wp:docPr id="8" name="Picture 8" descr="fig05_roc_curve"/>
             <a:graphic xmlns:a="http://schemas.openxmlformats.org/drawingml/2006/main">
               <a:graphicData uri="http://schemas.openxmlformats.org/drawingml/2006/picture">
                 <pic:pic xmlns:pic="http://schemas.openxmlformats.org/drawingml/2006/picture">
                   <pic:nvPicPr>
-                    <pic:cNvPr id="5" name="fig05_roc_curve.png"/>
+                    <pic:cNvPr id="8" name="fig05_roc_curve.png"/>
                     <pic:cNvPicPr/>
                   </pic:nvPicPr>
                   <pic:blipFill>
-                    <a:blip r:embed="rIdImg5"/>
+                    <a:blip r:embed="rIdImg8"/>
                     <a:stretch>
                       <a:fillRect/>
                     </a:stretch>
@@ -10411,16 +10555,16 @@
         <w:drawing>
           <wp:inline distT="0" distB="0" distL="0" distR="0">
             <wp:extent cx="5669280" cy="5019857"/>
-            <wp:docPr id="6" name="Picture 6" descr="fig06_confusion_matrix"/>
+            <wp:docPr id="9" name="Picture 9" descr="fig06_confusion_matrix"/>
             <a:graphic xmlns:a="http://schemas.openxmlformats.org/drawingml/2006/main">
               <a:graphicData uri="http://schemas.openxmlformats.org/drawingml/2006/picture">
                 <pic:pic xmlns:pic="http://schemas.openxmlformats.org/drawingml/2006/picture">
                   <pic:nvPicPr>
-                    <pic:cNvPr id="6" name="fig06_confusion_matrix.png"/>
+                    <pic:cNvPr id="9" name="fig06_confusion_matrix.png"/>
                     <pic:cNvPicPr/>
                   </pic:nvPicPr>
                   <pic:blipFill>
-                    <a:blip r:embed="rIdImg6"/>
+                    <a:blip r:embed="rIdImg9"/>
                     <a:stretch>
                       <a:fillRect/>
                     </a:stretch>
@@ -10770,16 +10914,16 @@
         <w:drawing>
           <wp:inline distT="0" distB="0" distL="0" distR="0">
             <wp:extent cx="5669280" cy="3692233"/>
-            <wp:docPr id="7" name="Picture 7" descr="fig09_accuracy_ceiling"/>
+            <wp:docPr id="10" name="Picture 10" descr="fig09_accuracy_ceiling"/>
             <a:graphic xmlns:a="http://schemas.openxmlformats.org/drawingml/2006/main">
               <a:graphicData uri="http://schemas.openxmlformats.org/drawingml/2006/picture">
                 <pic:pic xmlns:pic="http://schemas.openxmlformats.org/drawingml/2006/picture">
                   <pic:nvPicPr>
-                    <pic:cNvPr id="7" name="fig09_accuracy_ceiling.png"/>
+                    <pic:cNvPr id="10" name="fig09_accuracy_ceiling.png"/>
                     <pic:cNvPicPr/>
                   </pic:nvPicPr>
                   <pic:blipFill>
-                    <a:blip r:embed="rIdImg7"/>
+                    <a:blip r:embed="rIdImg10"/>
                     <a:stretch>
                       <a:fillRect/>
                     </a:stretch>
@@ -12503,16 +12647,16 @@
         <w:drawing>
           <wp:inline distT="0" distB="0" distL="0" distR="0">
             <wp:extent cx="5669280" cy="3113457"/>
-            <wp:docPr id="8" name="Picture 8" descr="fig07_representation_search"/>
+            <wp:docPr id="11" name="Picture 11" descr="fig07_representation_search"/>
             <a:graphic xmlns:a="http://schemas.openxmlformats.org/drawingml/2006/main">
               <a:graphicData uri="http://schemas.openxmlformats.org/drawingml/2006/picture">
                 <pic:pic xmlns:pic="http://schemas.openxmlformats.org/drawingml/2006/picture">
                   <pic:nvPicPr>
-                    <pic:cNvPr id="8" name="fig07_representation_search.png"/>
+                    <pic:cNvPr id="11" name="fig07_representation_search.png"/>
                     <pic:cNvPicPr/>
                   </pic:nvPicPr>
                   <pic:blipFill>
-                    <a:blip r:embed="rIdImg8"/>
+                    <a:blip r:embed="rIdImg11"/>
                     <a:stretch>
                       <a:fillRect/>
                     </a:stretch>
@@ -15501,17 +15645,17 @@
       <w:r>
         <w:drawing>
           <wp:inline distT="0" distB="0" distL="0" distR="0">
-            <wp:extent cx="5669280" cy="3503018"/>
-            <wp:docPr id="9" name="Picture 9" descr="fig08_method_comparison"/>
+            <wp:extent cx="5669280" cy="3598500"/>
+            <wp:docPr id="12" name="Picture 12" descr="fig08_method_comparison"/>
             <a:graphic xmlns:a="http://schemas.openxmlformats.org/drawingml/2006/main">
               <a:graphicData uri="http://schemas.openxmlformats.org/drawingml/2006/picture">
                 <pic:pic xmlns:pic="http://schemas.openxmlformats.org/drawingml/2006/picture">
                   <pic:nvPicPr>
-                    <pic:cNvPr id="9" name="fig08_method_comparison.png"/>
+                    <pic:cNvPr id="12" name="fig08_method_comparison.png"/>
                     <pic:cNvPicPr/>
                   </pic:nvPicPr>
                   <pic:blipFill>
-                    <a:blip r:embed="rIdImg9"/>
+                    <a:blip r:embed="rIdImg12"/>
                     <a:stretch>
                       <a:fillRect/>
                     </a:stretch>
@@ -15519,7 +15663,7 @@
                   <pic:spPr>
                     <a:xfrm>
                       <a:off x="0" y="0"/>
-                      <a:ext cx="5669280" cy="3503018"/>
+                      <a:ext cx="5669280" cy="3598500"/>
                     </a:xfrm>
                     <a:prstGeom prst="rect">
                       <a:avLst/>
@@ -15537,7 +15681,55 @@
         <w:pStyle w:val="Caption"/>
       </w:pPr>
       <w:r>
-        <w:t xml:space="preserve">Figure 8. Every method tried, on identical data and folds. Blue clears the permutation null; red does not.</w:t>
+        <w:t xml:space="preserve">Figure 8. Five representative methods on identical features and folds. Blue clears the permutation null; red does not. The estimator is not the same for every bar and is marked on each: [out-of-fold] is pooled balanced accuracy under nested CV, [sweep mean] is the mean over the six training percentages.</w:t>
+      </w:r>
+    </w:p>
+    <w:p>
+      <w:pPr>
+        <w:pStyle w:val="Normal"/>
+        <w:jc w:val="center"/>
+        <w:spacing w:before="160" w:after="60"/>
+      </w:pPr>
+      <w:r>
+        <w:drawing>
+          <wp:inline distT="0" distB="0" distL="0" distR="0">
+            <wp:extent cx="5669280" cy="3499898"/>
+            <wp:docPr id="13" name="Picture 13" descr="fig13_comparison_bar"/>
+            <a:graphic xmlns:a="http://schemas.openxmlformats.org/drawingml/2006/main">
+              <a:graphicData uri="http://schemas.openxmlformats.org/drawingml/2006/picture">
+                <pic:pic xmlns:pic="http://schemas.openxmlformats.org/drawingml/2006/picture">
+                  <pic:nvPicPr>
+                    <pic:cNvPr id="13" name="fig13_comparison_bar.png"/>
+                    <pic:cNvPicPr/>
+                  </pic:nvPicPr>
+                  <pic:blipFill>
+                    <a:blip r:embed="rIdImg13"/>
+                    <a:stretch>
+                      <a:fillRect/>
+                    </a:stretch>
+                  </pic:blipFill>
+                  <pic:spPr>
+                    <a:xfrm>
+                      <a:off x="0" y="0"/>
+                      <a:ext cx="5669280" cy="3499898"/>
+                    </a:xfrm>
+                    <a:prstGeom prst="rect">
+                      <a:avLst/>
+                    </a:prstGeom>
+                  </pic:spPr>
+                </pic:pic>
+              </a:graphicData>
+            </a:graphic>
+          </wp:inline>
+        </w:drawing>
+      </w:r>
+    </w:p>
+    <w:p>
+      <w:pPr>
+        <w:pStyle w:val="Caption"/>
+      </w:pPr>
+      <w:r>
+        <w:t xml:space="preserve">Figure 9. The full comparison: every method measured in this study on one axis, with its protocol in brackets. Colour encodes only whether a bar clears its own permutation null, so nothing here reads as more favourable than the statistics support — STIDNet at the top of the k-fold group is not coloured as significant because it was never permutation-tested.</w:t>
       </w:r>
     </w:p>
     <w:p>

</xml_diff>